<commit_message>
Documenting Flavors in Flutter
</commit_message>
<xml_diff>
--- a/f14_flutter_debug_and_android_studio_tools.docx
+++ b/f14_flutter_debug_and_android_studio_tools.docx
@@ -339,17 +339,19 @@
           <w:sz w:val="28"/>
           <w:szCs w:val="28"/>
         </w:rPr>
-        <w:t xml:space="preserve">|          </w:t>
-      </w:r>
-      <w:r>
+        <w:t>|                                |</w:t>
+      </w:r>
+    </w:p>
+    <w:p>
+      <w:pPr>
+        <w:jc w:val="both"/>
         <w:rPr>
           <w:b/>
           <w:bCs/>
           <w:sz w:val="28"/>
           <w:szCs w:val="28"/>
         </w:rPr>
-        <w:t xml:space="preserve">              </w:t>
-      </w:r>
+      </w:pPr>
       <w:r>
         <w:rPr>
           <w:b/>
@@ -357,19 +359,17 @@
           <w:sz w:val="28"/>
           <w:szCs w:val="28"/>
         </w:rPr>
-        <w:t xml:space="preserve">        |</w:t>
-      </w:r>
-    </w:p>
-    <w:p>
-      <w:pPr>
-        <w:jc w:val="both"/>
+        <w:t xml:space="preserve">|    </w:t>
+      </w:r>
+      <w:r>
         <w:rPr>
           <w:b/>
           <w:bCs/>
           <w:sz w:val="28"/>
           <w:szCs w:val="28"/>
         </w:rPr>
-      </w:pPr>
+        <w:t xml:space="preserve">    </w:t>
+      </w:r>
       <w:r>
         <w:rPr>
           <w:b/>
@@ -377,17 +377,19 @@
           <w:sz w:val="28"/>
           <w:szCs w:val="28"/>
         </w:rPr>
-        <w:t xml:space="preserve">|    </w:t>
-      </w:r>
-      <w:r>
+        <w:t xml:space="preserve">  Card           |</w:t>
+      </w:r>
+    </w:p>
+    <w:p>
+      <w:pPr>
+        <w:jc w:val="both"/>
         <w:rPr>
           <w:b/>
           <w:bCs/>
           <w:sz w:val="28"/>
           <w:szCs w:val="28"/>
         </w:rPr>
-        <w:t xml:space="preserve">    </w:t>
-      </w:r>
+      </w:pPr>
       <w:r>
         <w:rPr>
           <w:b/>
@@ -395,63 +397,7 @@
           <w:sz w:val="28"/>
           <w:szCs w:val="28"/>
         </w:rPr>
-        <w:t xml:space="preserve">  Card     </w:t>
-      </w:r>
-      <w:r>
-        <w:rPr>
-          <w:b/>
-          <w:bCs/>
-          <w:sz w:val="28"/>
-          <w:szCs w:val="28"/>
-        </w:rPr>
-        <w:t xml:space="preserve">     </w:t>
-      </w:r>
-      <w:r>
-        <w:rPr>
-          <w:b/>
-          <w:bCs/>
-          <w:sz w:val="28"/>
-          <w:szCs w:val="28"/>
-        </w:rPr>
-        <w:t xml:space="preserve"> |</w:t>
-      </w:r>
-    </w:p>
-    <w:p>
-      <w:pPr>
-        <w:jc w:val="both"/>
-        <w:rPr>
-          <w:b/>
-          <w:bCs/>
-          <w:sz w:val="28"/>
-          <w:szCs w:val="28"/>
-        </w:rPr>
-      </w:pPr>
-      <w:r>
-        <w:rPr>
-          <w:b/>
-          <w:bCs/>
-          <w:sz w:val="28"/>
-          <w:szCs w:val="28"/>
-        </w:rPr>
-        <w:t xml:space="preserve">|              </w:t>
-      </w:r>
-      <w:r>
-        <w:rPr>
-          <w:b/>
-          <w:bCs/>
-          <w:sz w:val="28"/>
-          <w:szCs w:val="28"/>
-        </w:rPr>
-        <w:t xml:space="preserve">             </w:t>
-      </w:r>
-      <w:r>
-        <w:rPr>
-          <w:b/>
-          <w:bCs/>
-          <w:sz w:val="28"/>
-          <w:szCs w:val="28"/>
-        </w:rPr>
-        <w:t xml:space="preserve"> </w:t>
+        <w:t xml:space="preserve">|                            </w:t>
       </w:r>
       <w:r>
         <w:rPr>
@@ -710,9 +656,18 @@
           <w:sz w:val="32"/>
           <w:szCs w:val="32"/>
         </w:rPr>
-        <w:t>SizedBox:</w:t>
+        <w:t>SizedBox</w:t>
       </w:r>
       <w:proofErr w:type="spellEnd"/>
+      <w:r>
+        <w:rPr>
+          <w:b/>
+          <w:bCs/>
+          <w:sz w:val="32"/>
+          <w:szCs w:val="32"/>
+        </w:rPr>
+        <w:t>:</w:t>
+      </w:r>
     </w:p>
     <w:p>
       <w:pPr>
@@ -780,14 +735,7 @@
           <w:sz w:val="32"/>
           <w:szCs w:val="32"/>
         </w:rPr>
-        <w:t>forgotten</w:t>
-      </w:r>
-      <w:r>
-        <w:rPr>
-          <w:sz w:val="32"/>
-          <w:szCs w:val="32"/>
-        </w:rPr>
-        <w:t>Column</w:t>
+        <w:t>forgottenColumn</w:t>
       </w:r>
       <w:proofErr w:type="spellEnd"/>
       <w:r>
@@ -4708,6 +4656,1356 @@
           <w:szCs w:val="32"/>
         </w:rPr>
         <w:t>();</w:t>
+      </w:r>
+    </w:p>
+    <w:p>
+      <w:pPr>
+        <w:jc w:val="both"/>
+        <w:rPr>
+          <w:sz w:val="32"/>
+          <w:szCs w:val="32"/>
+        </w:rPr>
+      </w:pPr>
+    </w:p>
+    <w:p>
+      <w:pPr>
+        <w:jc w:val="center"/>
+        <w:rPr>
+          <w:sz w:val="32"/>
+          <w:szCs w:val="32"/>
+        </w:rPr>
+      </w:pPr>
+      <w:r>
+        <w:rPr>
+          <w:sz w:val="32"/>
+          <w:szCs w:val="32"/>
+        </w:rPr>
+        <w:t>Break</w:t>
+      </w:r>
+    </w:p>
+    <w:p>
+      <w:pPr>
+        <w:jc w:val="both"/>
+        <w:rPr>
+          <w:sz w:val="32"/>
+          <w:szCs w:val="32"/>
+        </w:rPr>
+      </w:pPr>
+    </w:p>
+    <w:p>
+      <w:pPr>
+        <w:jc w:val="both"/>
+        <w:rPr>
+          <w:b/>
+          <w:bCs/>
+          <w:sz w:val="32"/>
+          <w:szCs w:val="32"/>
+        </w:rPr>
+      </w:pPr>
+      <w:r>
+        <w:rPr>
+          <w:b/>
+          <w:bCs/>
+          <w:sz w:val="32"/>
+          <w:szCs w:val="32"/>
+        </w:rPr>
+        <w:t>Edit Android Studio Run Configurations:</w:t>
+      </w:r>
+    </w:p>
+    <w:p>
+      <w:pPr>
+        <w:jc w:val="both"/>
+        <w:rPr>
+          <w:sz w:val="32"/>
+          <w:szCs w:val="32"/>
+        </w:rPr>
+      </w:pPr>
+      <w:r>
+        <w:rPr>
+          <w:sz w:val="32"/>
+          <w:szCs w:val="32"/>
+        </w:rPr>
+        <w:t xml:space="preserve"># Go to the three dots beside the play and debug button on the top or the </w:t>
+      </w:r>
+      <w:proofErr w:type="spellStart"/>
+      <w:proofErr w:type="gramStart"/>
+      <w:r>
+        <w:rPr>
+          <w:b/>
+          <w:bCs/>
+          <w:sz w:val="32"/>
+          <w:szCs w:val="32"/>
+        </w:rPr>
+        <w:t>main.dart</w:t>
+      </w:r>
+      <w:proofErr w:type="spellEnd"/>
+      <w:proofErr w:type="gramEnd"/>
+      <w:r>
+        <w:rPr>
+          <w:sz w:val="32"/>
+          <w:szCs w:val="32"/>
+        </w:rPr>
+        <w:t>. Click on it then edit Run configuration.</w:t>
+      </w:r>
+    </w:p>
+    <w:p>
+      <w:pPr>
+        <w:jc w:val="both"/>
+        <w:rPr>
+          <w:sz w:val="32"/>
+          <w:szCs w:val="32"/>
+        </w:rPr>
+      </w:pPr>
+      <w:r>
+        <w:rPr>
+          <w:sz w:val="32"/>
+          <w:szCs w:val="32"/>
+        </w:rPr>
+        <w:t xml:space="preserve"># Here we can set the Flavor in </w:t>
+      </w:r>
+      <w:r>
+        <w:rPr>
+          <w:b/>
+          <w:bCs/>
+          <w:sz w:val="32"/>
+          <w:szCs w:val="32"/>
+        </w:rPr>
+        <w:t>Build flavor:</w:t>
+      </w:r>
+      <w:r>
+        <w:rPr>
+          <w:sz w:val="32"/>
+          <w:szCs w:val="32"/>
+        </w:rPr>
+        <w:t xml:space="preserve"> and we don’t have to manually run this command, </w:t>
+      </w:r>
+      <w:r>
+        <w:rPr>
+          <w:b/>
+          <w:bCs/>
+          <w:sz w:val="32"/>
+          <w:szCs w:val="32"/>
+        </w:rPr>
+        <w:t>--flavor</w:t>
+      </w:r>
+      <w:r>
+        <w:rPr>
+          <w:sz w:val="32"/>
+          <w:szCs w:val="32"/>
+        </w:rPr>
+        <w:t xml:space="preserve"> flag will be specified by Android Studio</w:t>
+      </w:r>
+    </w:p>
+    <w:p>
+      <w:pPr>
+        <w:jc w:val="both"/>
+        <w:rPr>
+          <w:b/>
+          <w:bCs/>
+          <w:color w:val="60CAF3" w:themeColor="accent4" w:themeTint="99"/>
+          <w:sz w:val="32"/>
+          <w:szCs w:val="32"/>
+        </w:rPr>
+      </w:pPr>
+      <w:r>
+        <w:rPr>
+          <w:b/>
+          <w:bCs/>
+          <w:color w:val="60CAF3" w:themeColor="accent4" w:themeTint="99"/>
+          <w:sz w:val="32"/>
+          <w:szCs w:val="32"/>
+        </w:rPr>
+        <w:t>flutter run -d emulator-5554 --flag staging</w:t>
+      </w:r>
+    </w:p>
+    <w:p>
+      <w:pPr>
+        <w:jc w:val="both"/>
+        <w:rPr>
+          <w:sz w:val="32"/>
+          <w:szCs w:val="32"/>
+        </w:rPr>
+      </w:pPr>
+    </w:p>
+    <w:p>
+      <w:pPr>
+        <w:jc w:val="both"/>
+        <w:rPr>
+          <w:sz w:val="32"/>
+          <w:szCs w:val="32"/>
+        </w:rPr>
+      </w:pPr>
+      <w:r>
+        <w:rPr>
+          <w:sz w:val="32"/>
+          <w:szCs w:val="32"/>
+        </w:rPr>
+        <w:t>Environment Variables in Configuration:</w:t>
+      </w:r>
+    </w:p>
+    <w:p>
+      <w:pPr>
+        <w:jc w:val="both"/>
+        <w:rPr>
+          <w:sz w:val="32"/>
+          <w:szCs w:val="32"/>
+        </w:rPr>
+      </w:pPr>
+      <w:r>
+        <w:rPr>
+          <w:sz w:val="32"/>
+          <w:szCs w:val="32"/>
+        </w:rPr>
+        <w:t xml:space="preserve"># We can also set the environment variables without using </w:t>
+      </w:r>
+      <w:r>
+        <w:rPr>
+          <w:b/>
+          <w:bCs/>
+          <w:sz w:val="32"/>
+          <w:szCs w:val="32"/>
+        </w:rPr>
+        <w:t>--dart-define</w:t>
+      </w:r>
+      <w:r>
+        <w:rPr>
+          <w:sz w:val="32"/>
+          <w:szCs w:val="32"/>
+        </w:rPr>
+        <w:t xml:space="preserve"> flag by adding the variables in </w:t>
+      </w:r>
+      <w:r>
+        <w:rPr>
+          <w:b/>
+          <w:bCs/>
+          <w:sz w:val="32"/>
+          <w:szCs w:val="32"/>
+        </w:rPr>
+        <w:t>Environment Variable:</w:t>
+      </w:r>
+    </w:p>
+    <w:p>
+      <w:pPr>
+        <w:jc w:val="both"/>
+        <w:rPr>
+          <w:sz w:val="32"/>
+          <w:szCs w:val="32"/>
+        </w:rPr>
+      </w:pPr>
+      <w:r>
+        <w:rPr>
+          <w:sz w:val="32"/>
+          <w:szCs w:val="32"/>
+        </w:rPr>
+        <w:t xml:space="preserve"># Its good for without Flavor based environment variable changing (like </w:t>
+      </w:r>
+      <w:r>
+        <w:rPr>
+          <w:b/>
+          <w:bCs/>
+          <w:sz w:val="32"/>
+          <w:szCs w:val="32"/>
+        </w:rPr>
+        <w:t>env/</w:t>
+      </w:r>
+      <w:proofErr w:type="spellStart"/>
+      <w:r>
+        <w:rPr>
+          <w:b/>
+          <w:bCs/>
+          <w:sz w:val="32"/>
+          <w:szCs w:val="32"/>
+        </w:rPr>
+        <w:t>dev.json</w:t>
+      </w:r>
+      <w:proofErr w:type="spellEnd"/>
+      <w:r>
+        <w:rPr>
+          <w:sz w:val="32"/>
+          <w:szCs w:val="32"/>
+        </w:rPr>
+        <w:t xml:space="preserve">, </w:t>
+      </w:r>
+      <w:r>
+        <w:rPr>
+          <w:b/>
+          <w:bCs/>
+          <w:sz w:val="32"/>
+          <w:szCs w:val="32"/>
+        </w:rPr>
+        <w:t>env/</w:t>
+      </w:r>
+      <w:proofErr w:type="spellStart"/>
+      <w:r>
+        <w:rPr>
+          <w:b/>
+          <w:bCs/>
+          <w:sz w:val="32"/>
+          <w:szCs w:val="32"/>
+        </w:rPr>
+        <w:t>prod.json</w:t>
+      </w:r>
+      <w:proofErr w:type="spellEnd"/>
+      <w:r>
+        <w:rPr>
+          <w:sz w:val="32"/>
+          <w:szCs w:val="32"/>
+        </w:rPr>
+        <w:t>)</w:t>
+      </w:r>
+    </w:p>
+    <w:p>
+      <w:pPr>
+        <w:jc w:val="both"/>
+        <w:rPr>
+          <w:sz w:val="32"/>
+          <w:szCs w:val="32"/>
+        </w:rPr>
+      </w:pPr>
+    </w:p>
+    <w:p>
+      <w:pPr>
+        <w:jc w:val="both"/>
+        <w:rPr>
+          <w:sz w:val="32"/>
+          <w:szCs w:val="32"/>
+        </w:rPr>
+      </w:pPr>
+      <w:r>
+        <w:rPr>
+          <w:sz w:val="32"/>
+          <w:szCs w:val="32"/>
+        </w:rPr>
+        <w:t>Dart-define in Configuration:</w:t>
+      </w:r>
+    </w:p>
+    <w:p>
+      <w:pPr>
+        <w:jc w:val="both"/>
+        <w:rPr>
+          <w:sz w:val="32"/>
+          <w:szCs w:val="32"/>
+        </w:rPr>
+      </w:pPr>
+      <w:r>
+        <w:rPr>
+          <w:sz w:val="32"/>
+          <w:szCs w:val="32"/>
+        </w:rPr>
+        <w:t xml:space="preserve"># Find the </w:t>
+      </w:r>
+      <w:r>
+        <w:rPr>
+          <w:b/>
+          <w:bCs/>
+          <w:sz w:val="32"/>
+          <w:szCs w:val="32"/>
+        </w:rPr>
+        <w:t xml:space="preserve">Additional run </w:t>
+      </w:r>
+      <w:proofErr w:type="spellStart"/>
+      <w:r>
+        <w:rPr>
+          <w:b/>
+          <w:bCs/>
+          <w:sz w:val="32"/>
+          <w:szCs w:val="32"/>
+        </w:rPr>
+        <w:t>args</w:t>
+      </w:r>
+      <w:proofErr w:type="spellEnd"/>
+      <w:r>
+        <w:rPr>
+          <w:b/>
+          <w:bCs/>
+          <w:sz w:val="32"/>
+          <w:szCs w:val="32"/>
+        </w:rPr>
+        <w:t>:</w:t>
+      </w:r>
+      <w:r>
+        <w:rPr>
+          <w:sz w:val="32"/>
+          <w:szCs w:val="32"/>
+        </w:rPr>
+        <w:t xml:space="preserve"> field and add our</w:t>
+      </w:r>
+      <w:r>
+        <w:rPr>
+          <w:b/>
+          <w:bCs/>
+          <w:sz w:val="32"/>
+          <w:szCs w:val="32"/>
+        </w:rPr>
+        <w:t xml:space="preserve"> --dart-define</w:t>
+      </w:r>
+    </w:p>
+    <w:p>
+      <w:pPr>
+        <w:jc w:val="both"/>
+        <w:rPr>
+          <w:b/>
+          <w:bCs/>
+          <w:color w:val="60CAF3" w:themeColor="accent4" w:themeTint="99"/>
+          <w:sz w:val="32"/>
+          <w:szCs w:val="32"/>
+        </w:rPr>
+      </w:pPr>
+      <w:r>
+        <w:rPr>
+          <w:b/>
+          <w:bCs/>
+          <w:color w:val="60CAF3" w:themeColor="accent4" w:themeTint="99"/>
+          <w:sz w:val="32"/>
+          <w:szCs w:val="32"/>
+        </w:rPr>
+        <w:lastRenderedPageBreak/>
+        <w:t>--dart-define=API_URL=https://dev.example.com</w:t>
+      </w:r>
+    </w:p>
+    <w:p>
+      <w:pPr>
+        <w:jc w:val="both"/>
+        <w:rPr>
+          <w:sz w:val="32"/>
+          <w:szCs w:val="32"/>
+        </w:rPr>
+      </w:pPr>
+      <w:r>
+        <w:rPr>
+          <w:sz w:val="32"/>
+          <w:szCs w:val="32"/>
+        </w:rPr>
+        <w:t xml:space="preserve"># </w:t>
+      </w:r>
+      <w:r>
+        <w:rPr>
+          <w:sz w:val="32"/>
+          <w:szCs w:val="32"/>
+        </w:rPr>
+        <w:t xml:space="preserve">Or if we’re using a </w:t>
+      </w:r>
+      <w:r>
+        <w:rPr>
+          <w:b/>
+          <w:bCs/>
+          <w:sz w:val="32"/>
+          <w:szCs w:val="32"/>
+        </w:rPr>
+        <w:t>Dart</w:t>
+      </w:r>
+      <w:r>
+        <w:rPr>
+          <w:sz w:val="32"/>
+          <w:szCs w:val="32"/>
+        </w:rPr>
+        <w:t xml:space="preserve"> define file then:</w:t>
+      </w:r>
+    </w:p>
+    <w:p>
+      <w:pPr>
+        <w:jc w:val="both"/>
+        <w:rPr>
+          <w:b/>
+          <w:bCs/>
+          <w:color w:val="60CAF3" w:themeColor="accent4" w:themeTint="99"/>
+          <w:sz w:val="32"/>
+          <w:szCs w:val="32"/>
+        </w:rPr>
+      </w:pPr>
+      <w:r>
+        <w:rPr>
+          <w:b/>
+          <w:bCs/>
+          <w:color w:val="60CAF3" w:themeColor="accent4" w:themeTint="99"/>
+          <w:sz w:val="32"/>
+          <w:szCs w:val="32"/>
+        </w:rPr>
+        <w:t>--dart-define-from-file=config/</w:t>
+      </w:r>
+      <w:proofErr w:type="spellStart"/>
+      <w:r>
+        <w:rPr>
+          <w:b/>
+          <w:bCs/>
+          <w:color w:val="60CAF3" w:themeColor="accent4" w:themeTint="99"/>
+          <w:sz w:val="32"/>
+          <w:szCs w:val="32"/>
+        </w:rPr>
+        <w:t>dev.json</w:t>
+      </w:r>
+      <w:proofErr w:type="spellEnd"/>
+    </w:p>
+    <w:p>
+      <w:pPr>
+        <w:jc w:val="both"/>
+        <w:rPr>
+          <w:sz w:val="32"/>
+          <w:szCs w:val="32"/>
+        </w:rPr>
+      </w:pPr>
+      <w:r>
+        <w:rPr>
+          <w:sz w:val="32"/>
+          <w:szCs w:val="32"/>
+        </w:rPr>
+        <w:t># Now whenever the green Run button is pressed. Android Studio automatically runs with those arguments</w:t>
+      </w:r>
+    </w:p>
+    <w:p>
+      <w:pPr>
+        <w:jc w:val="both"/>
+        <w:rPr>
+          <w:sz w:val="32"/>
+          <w:szCs w:val="32"/>
+        </w:rPr>
+      </w:pPr>
+      <w:r>
+        <w:rPr>
+          <w:sz w:val="32"/>
+          <w:szCs w:val="32"/>
+        </w:rPr>
+        <w:t># Then in the run console, we can see it being added</w:t>
+      </w:r>
+    </w:p>
+    <w:p>
+      <w:pPr>
+        <w:jc w:val="both"/>
+        <w:rPr>
+          <w:b/>
+          <w:bCs/>
+          <w:sz w:val="32"/>
+          <w:szCs w:val="32"/>
+        </w:rPr>
+      </w:pPr>
+      <w:r>
+        <w:rPr>
+          <w:b/>
+          <w:bCs/>
+          <w:sz w:val="32"/>
+          <w:szCs w:val="32"/>
+        </w:rPr>
+        <w:t>C:\flutter\src\flutter\bin\flutter.bat --no-color run --machine --track-widget-creation --device-id=emulator-5554 --start-paused --dart-define=API_URL=https://dev.example.com --dart-define=</w:t>
+      </w:r>
+      <w:proofErr w:type="spellStart"/>
+      <w:proofErr w:type="gramStart"/>
+      <w:r>
+        <w:rPr>
+          <w:b/>
+          <w:bCs/>
+          <w:sz w:val="32"/>
+          <w:szCs w:val="32"/>
+        </w:rPr>
+        <w:t>flutter.inspector</w:t>
+      </w:r>
+      <w:proofErr w:type="gramEnd"/>
+      <w:r>
+        <w:rPr>
+          <w:b/>
+          <w:bCs/>
+          <w:sz w:val="32"/>
+          <w:szCs w:val="32"/>
+        </w:rPr>
+        <w:t>.structuredErrors</w:t>
+      </w:r>
+      <w:proofErr w:type="spellEnd"/>
+      <w:r>
+        <w:rPr>
+          <w:b/>
+          <w:bCs/>
+          <w:sz w:val="32"/>
+          <w:szCs w:val="32"/>
+        </w:rPr>
+        <w:t>=true --</w:t>
+      </w:r>
+      <w:proofErr w:type="spellStart"/>
+      <w:r>
+        <w:rPr>
+          <w:b/>
+          <w:bCs/>
+          <w:sz w:val="32"/>
+          <w:szCs w:val="32"/>
+        </w:rPr>
+        <w:t>devtools</w:t>
+      </w:r>
+      <w:proofErr w:type="spellEnd"/>
+      <w:r>
+        <w:rPr>
+          <w:b/>
+          <w:bCs/>
+          <w:sz w:val="32"/>
+          <w:szCs w:val="32"/>
+        </w:rPr>
+        <w:t>-server-address=http://127.0.0.1:9100 lib\</w:t>
+      </w:r>
+      <w:proofErr w:type="spellStart"/>
+      <w:r>
+        <w:rPr>
+          <w:b/>
+          <w:bCs/>
+          <w:sz w:val="32"/>
+          <w:szCs w:val="32"/>
+        </w:rPr>
+        <w:t>main.dart</w:t>
+      </w:r>
+      <w:proofErr w:type="spellEnd"/>
+    </w:p>
+    <w:p>
+      <w:pPr>
+        <w:jc w:val="both"/>
+        <w:rPr>
+          <w:sz w:val="32"/>
+          <w:szCs w:val="32"/>
+        </w:rPr>
+      </w:pPr>
+    </w:p>
+    <w:p>
+      <w:pPr>
+        <w:jc w:val="both"/>
+        <w:rPr>
+          <w:sz w:val="32"/>
+          <w:szCs w:val="32"/>
+        </w:rPr>
+      </w:pPr>
+      <w:r>
+        <w:rPr>
+          <w:sz w:val="32"/>
+          <w:szCs w:val="32"/>
+        </w:rPr>
+        <w:t>One Configuration Per Flavor:</w:t>
+      </w:r>
+    </w:p>
+    <w:p>
+      <w:pPr>
+        <w:jc w:val="both"/>
+        <w:rPr>
+          <w:sz w:val="32"/>
+          <w:szCs w:val="32"/>
+        </w:rPr>
+      </w:pPr>
+      <w:r>
+        <w:rPr>
+          <w:sz w:val="32"/>
+          <w:szCs w:val="32"/>
+        </w:rPr>
+        <w:t xml:space="preserve"># We can also create multiple configurations based on different </w:t>
+      </w:r>
+      <w:r>
+        <w:rPr>
+          <w:b/>
+          <w:bCs/>
+          <w:sz w:val="32"/>
+          <w:szCs w:val="32"/>
+        </w:rPr>
+        <w:t xml:space="preserve">Flavors </w:t>
+      </w:r>
+      <w:r>
+        <w:rPr>
+          <w:sz w:val="32"/>
+          <w:szCs w:val="32"/>
+        </w:rPr>
+        <w:t xml:space="preserve">and </w:t>
+      </w:r>
+      <w:r>
+        <w:rPr>
+          <w:b/>
+          <w:bCs/>
+          <w:sz w:val="32"/>
+          <w:szCs w:val="32"/>
+        </w:rPr>
+        <w:t>--dart-define</w:t>
+      </w:r>
+    </w:p>
+    <w:p>
+      <w:pPr>
+        <w:jc w:val="both"/>
+        <w:rPr>
+          <w:sz w:val="32"/>
+          <w:szCs w:val="32"/>
+        </w:rPr>
+      </w:pPr>
+      <w:r>
+        <w:rPr>
+          <w:sz w:val="32"/>
+          <w:szCs w:val="32"/>
+        </w:rPr>
+        <w:t xml:space="preserve"># Just go to Run configuration, there we can see </w:t>
+      </w:r>
+      <w:proofErr w:type="spellStart"/>
+      <w:proofErr w:type="gramStart"/>
+      <w:r>
+        <w:rPr>
+          <w:b/>
+          <w:bCs/>
+          <w:sz w:val="32"/>
+          <w:szCs w:val="32"/>
+        </w:rPr>
+        <w:t>main.dart</w:t>
+      </w:r>
+      <w:proofErr w:type="spellEnd"/>
+      <w:proofErr w:type="gramEnd"/>
+      <w:r>
+        <w:rPr>
+          <w:sz w:val="32"/>
+          <w:szCs w:val="32"/>
+        </w:rPr>
+        <w:t xml:space="preserve"> already present. Click on the </w:t>
+      </w:r>
+      <w:r>
+        <w:rPr>
+          <w:b/>
+          <w:bCs/>
+          <w:sz w:val="32"/>
+          <w:szCs w:val="32"/>
+        </w:rPr>
+        <w:t>+</w:t>
+      </w:r>
+      <w:r>
+        <w:rPr>
+          <w:sz w:val="32"/>
+          <w:szCs w:val="32"/>
+        </w:rPr>
+        <w:t xml:space="preserve"> icon and then click on </w:t>
+      </w:r>
+      <w:r>
+        <w:rPr>
+          <w:b/>
+          <w:bCs/>
+          <w:sz w:val="32"/>
+          <w:szCs w:val="32"/>
+        </w:rPr>
+        <w:t>Flutter</w:t>
+      </w:r>
+      <w:r>
+        <w:rPr>
+          <w:sz w:val="32"/>
+          <w:szCs w:val="32"/>
+        </w:rPr>
+        <w:t xml:space="preserve"> icon. Set the name according to the Flavor like </w:t>
+      </w:r>
+      <w:proofErr w:type="spellStart"/>
+      <w:r>
+        <w:rPr>
+          <w:b/>
+          <w:bCs/>
+          <w:sz w:val="32"/>
+          <w:szCs w:val="32"/>
+        </w:rPr>
+        <w:t>main_</w:t>
+      </w:r>
+      <w:proofErr w:type="gramStart"/>
+      <w:r>
+        <w:rPr>
+          <w:b/>
+          <w:bCs/>
+          <w:sz w:val="32"/>
+          <w:szCs w:val="32"/>
+        </w:rPr>
+        <w:t>dev.dart</w:t>
+      </w:r>
+      <w:proofErr w:type="spellEnd"/>
+      <w:proofErr w:type="gramEnd"/>
+    </w:p>
+    <w:p>
+      <w:pPr>
+        <w:jc w:val="both"/>
+        <w:rPr>
+          <w:sz w:val="32"/>
+          <w:szCs w:val="32"/>
+        </w:rPr>
+      </w:pPr>
+      <w:r>
+        <w:rPr>
+          <w:sz w:val="32"/>
+          <w:szCs w:val="32"/>
+        </w:rPr>
+        <w:t xml:space="preserve"># Set </w:t>
+      </w:r>
+      <w:r>
+        <w:rPr>
+          <w:b/>
+          <w:bCs/>
+          <w:sz w:val="32"/>
+          <w:szCs w:val="32"/>
+        </w:rPr>
+        <w:t xml:space="preserve">Dart </w:t>
+      </w:r>
+      <w:proofErr w:type="spellStart"/>
+      <w:r>
+        <w:rPr>
+          <w:b/>
+          <w:bCs/>
+          <w:sz w:val="32"/>
+          <w:szCs w:val="32"/>
+        </w:rPr>
+        <w:t>entrypoint</w:t>
+      </w:r>
+      <w:proofErr w:type="spellEnd"/>
+      <w:r>
+        <w:rPr>
+          <w:b/>
+          <w:bCs/>
+          <w:sz w:val="32"/>
+          <w:szCs w:val="32"/>
+        </w:rPr>
+        <w:t>:</w:t>
+      </w:r>
+      <w:r>
+        <w:rPr>
+          <w:sz w:val="32"/>
+          <w:szCs w:val="32"/>
+        </w:rPr>
+        <w:t xml:space="preserve"> by clicking on the file icon and pointing to </w:t>
+      </w:r>
+      <w:r>
+        <w:rPr>
+          <w:b/>
+          <w:bCs/>
+          <w:sz w:val="32"/>
+          <w:szCs w:val="32"/>
+        </w:rPr>
+        <w:t>C:\flutter_projects_ostad\of29_flutter_flavors\lib\main.dart</w:t>
+      </w:r>
+      <w:r>
+        <w:rPr>
+          <w:sz w:val="32"/>
+          <w:szCs w:val="32"/>
+        </w:rPr>
+        <w:t xml:space="preserve"> or to</w:t>
+      </w:r>
+      <w:r>
+        <w:rPr>
+          <w:b/>
+          <w:bCs/>
+          <w:sz w:val="32"/>
+          <w:szCs w:val="32"/>
+        </w:rPr>
+        <w:t xml:space="preserve"> </w:t>
+      </w:r>
+      <w:proofErr w:type="spellStart"/>
+      <w:r>
+        <w:rPr>
+          <w:b/>
+          <w:bCs/>
+          <w:sz w:val="32"/>
+          <w:szCs w:val="32"/>
+        </w:rPr>
+        <w:t>main_</w:t>
+      </w:r>
+      <w:proofErr w:type="gramStart"/>
+      <w:r>
+        <w:rPr>
+          <w:b/>
+          <w:bCs/>
+          <w:sz w:val="32"/>
+          <w:szCs w:val="32"/>
+        </w:rPr>
+        <w:t>dev.dart</w:t>
+      </w:r>
+      <w:proofErr w:type="spellEnd"/>
+      <w:proofErr w:type="gramEnd"/>
+      <w:r>
+        <w:rPr>
+          <w:sz w:val="32"/>
+          <w:szCs w:val="32"/>
+        </w:rPr>
+        <w:t xml:space="preserve"> (according to project setup)</w:t>
+      </w:r>
+    </w:p>
+    <w:p>
+      <w:pPr>
+        <w:jc w:val="both"/>
+        <w:rPr>
+          <w:sz w:val="32"/>
+          <w:szCs w:val="32"/>
+        </w:rPr>
+      </w:pPr>
+      <w:r>
+        <w:rPr>
+          <w:sz w:val="32"/>
+          <w:szCs w:val="32"/>
+        </w:rPr>
+        <w:t xml:space="preserve"># Then set the </w:t>
+      </w:r>
+      <w:r>
+        <w:rPr>
+          <w:b/>
+          <w:bCs/>
+          <w:sz w:val="32"/>
+          <w:szCs w:val="32"/>
+        </w:rPr>
+        <w:t>Build flavor:</w:t>
+      </w:r>
+      <w:r>
+        <w:rPr>
+          <w:sz w:val="32"/>
+          <w:szCs w:val="32"/>
+        </w:rPr>
+        <w:t xml:space="preserve"> to dev and add</w:t>
+      </w:r>
+      <w:r>
+        <w:rPr>
+          <w:b/>
+          <w:bCs/>
+          <w:sz w:val="32"/>
+          <w:szCs w:val="32"/>
+        </w:rPr>
+        <w:t xml:space="preserve"> --dart-define-from-file=config/</w:t>
+      </w:r>
+      <w:proofErr w:type="spellStart"/>
+      <w:r>
+        <w:rPr>
+          <w:b/>
+          <w:bCs/>
+          <w:sz w:val="32"/>
+          <w:szCs w:val="32"/>
+        </w:rPr>
+        <w:t>dev.json</w:t>
+      </w:r>
+      <w:proofErr w:type="spellEnd"/>
+      <w:r>
+        <w:rPr>
+          <w:b/>
+          <w:bCs/>
+          <w:sz w:val="32"/>
+          <w:szCs w:val="32"/>
+        </w:rPr>
+        <w:t xml:space="preserve"> </w:t>
+      </w:r>
+      <w:r>
+        <w:rPr>
+          <w:sz w:val="32"/>
+          <w:szCs w:val="32"/>
+        </w:rPr>
+        <w:t xml:space="preserve">in </w:t>
+      </w:r>
+      <w:r>
+        <w:rPr>
+          <w:b/>
+          <w:bCs/>
+          <w:sz w:val="32"/>
+          <w:szCs w:val="32"/>
+        </w:rPr>
+        <w:t xml:space="preserve">Additional </w:t>
+      </w:r>
+      <w:proofErr w:type="spellStart"/>
+      <w:r>
+        <w:rPr>
+          <w:b/>
+          <w:bCs/>
+          <w:sz w:val="32"/>
+          <w:szCs w:val="32"/>
+        </w:rPr>
+        <w:t>args</w:t>
+      </w:r>
+      <w:proofErr w:type="spellEnd"/>
+      <w:r>
+        <w:rPr>
+          <w:b/>
+          <w:bCs/>
+          <w:sz w:val="32"/>
+          <w:szCs w:val="32"/>
+        </w:rPr>
+        <w:t>:</w:t>
+      </w:r>
+    </w:p>
+    <w:p>
+      <w:pPr>
+        <w:jc w:val="both"/>
+        <w:rPr>
+          <w:sz w:val="32"/>
+          <w:szCs w:val="32"/>
+        </w:rPr>
+      </w:pPr>
+      <w:r>
+        <w:rPr>
+          <w:sz w:val="32"/>
+          <w:szCs w:val="32"/>
+        </w:rPr>
+        <w:t># So when we run that Configuration (</w:t>
+      </w:r>
+      <w:proofErr w:type="spellStart"/>
+      <w:r>
+        <w:rPr>
+          <w:b/>
+          <w:bCs/>
+          <w:sz w:val="32"/>
+          <w:szCs w:val="32"/>
+        </w:rPr>
+        <w:t>main_</w:t>
+      </w:r>
+      <w:proofErr w:type="gramStart"/>
+      <w:r>
+        <w:rPr>
+          <w:b/>
+          <w:bCs/>
+          <w:sz w:val="32"/>
+          <w:szCs w:val="32"/>
+        </w:rPr>
+        <w:t>dev.dart</w:t>
+      </w:r>
+      <w:proofErr w:type="spellEnd"/>
+      <w:proofErr w:type="gramEnd"/>
+      <w:r>
+        <w:rPr>
+          <w:sz w:val="32"/>
+          <w:szCs w:val="32"/>
+        </w:rPr>
+        <w:t xml:space="preserve">), Flavors and </w:t>
+      </w:r>
+      <w:r>
+        <w:rPr>
+          <w:b/>
+          <w:bCs/>
+          <w:sz w:val="32"/>
+          <w:szCs w:val="32"/>
+        </w:rPr>
+        <w:t>--dart-define</w:t>
+      </w:r>
+      <w:r>
+        <w:rPr>
+          <w:sz w:val="32"/>
+          <w:szCs w:val="32"/>
+        </w:rPr>
+        <w:t xml:space="preserve"> will au</w:t>
+      </w:r>
+      <w:r>
+        <w:rPr>
+          <w:sz w:val="32"/>
+          <w:szCs w:val="32"/>
+        </w:rPr>
+        <w:t>tomatically added by android. No manual command needed like this”</w:t>
+      </w:r>
+    </w:p>
+    <w:p>
+      <w:pPr>
+        <w:jc w:val="both"/>
+        <w:rPr>
+          <w:b/>
+          <w:bCs/>
+          <w:color w:val="60CAF3" w:themeColor="accent4" w:themeTint="99"/>
+          <w:sz w:val="32"/>
+          <w:szCs w:val="32"/>
+        </w:rPr>
+      </w:pPr>
+      <w:r>
+        <w:rPr>
+          <w:b/>
+          <w:bCs/>
+          <w:color w:val="60CAF3" w:themeColor="accent4" w:themeTint="99"/>
+          <w:sz w:val="32"/>
+          <w:szCs w:val="32"/>
+        </w:rPr>
+        <w:lastRenderedPageBreak/>
+        <w:t>flutter run -d emulator-5554 --flavor --dart-define-from-file=config/</w:t>
+      </w:r>
+      <w:proofErr w:type="spellStart"/>
+      <w:r>
+        <w:rPr>
+          <w:b/>
+          <w:bCs/>
+          <w:color w:val="60CAF3" w:themeColor="accent4" w:themeTint="99"/>
+          <w:sz w:val="32"/>
+          <w:szCs w:val="32"/>
+        </w:rPr>
+        <w:t>dev.json</w:t>
+      </w:r>
+      <w:proofErr w:type="spellEnd"/>
+    </w:p>
+    <w:p>
+      <w:pPr>
+        <w:jc w:val="both"/>
+        <w:rPr>
+          <w:sz w:val="32"/>
+          <w:szCs w:val="32"/>
+        </w:rPr>
+      </w:pPr>
+      <w:r>
+        <w:rPr>
+          <w:sz w:val="32"/>
+          <w:szCs w:val="32"/>
+        </w:rPr>
+        <w:t># By doing these we can create and run different Run Configurations based on Flavor quickly without using any command:</w:t>
+      </w:r>
+    </w:p>
+    <w:p>
+      <w:pPr>
+        <w:pStyle w:val="ListParagraph"/>
+        <w:numPr>
+          <w:ilvl w:val="0"/>
+          <w:numId w:val="7"/>
+        </w:numPr>
+        <w:jc w:val="both"/>
+        <w:rPr>
+          <w:sz w:val="32"/>
+          <w:szCs w:val="32"/>
+        </w:rPr>
+      </w:pPr>
+      <w:proofErr w:type="spellStart"/>
+      <w:proofErr w:type="gramStart"/>
+      <w:r>
+        <w:rPr>
+          <w:b/>
+          <w:bCs/>
+          <w:sz w:val="32"/>
+          <w:szCs w:val="32"/>
+        </w:rPr>
+        <w:t>main.dart</w:t>
+      </w:r>
+      <w:proofErr w:type="spellEnd"/>
+      <w:proofErr w:type="gramEnd"/>
+      <w:r>
+        <w:rPr>
+          <w:sz w:val="32"/>
+          <w:szCs w:val="32"/>
+        </w:rPr>
+        <w:t xml:space="preserve"> </w:t>
+      </w:r>
+      <w:r>
+        <w:sym w:font="Wingdings" w:char="F0E0"/>
+      </w:r>
+      <w:r>
+        <w:rPr>
+          <w:sz w:val="32"/>
+          <w:szCs w:val="32"/>
+        </w:rPr>
+        <w:t xml:space="preserve"> --flavor production --dart-define-from-file=config/</w:t>
+      </w:r>
+      <w:proofErr w:type="spellStart"/>
+      <w:r>
+        <w:rPr>
+          <w:sz w:val="32"/>
+          <w:szCs w:val="32"/>
+        </w:rPr>
+        <w:t>prod.json</w:t>
+      </w:r>
+      <w:proofErr w:type="spellEnd"/>
+    </w:p>
+    <w:p>
+      <w:pPr>
+        <w:pStyle w:val="ListParagraph"/>
+        <w:numPr>
+          <w:ilvl w:val="0"/>
+          <w:numId w:val="7"/>
+        </w:numPr>
+        <w:jc w:val="both"/>
+        <w:rPr>
+          <w:sz w:val="32"/>
+          <w:szCs w:val="32"/>
+        </w:rPr>
+      </w:pPr>
+      <w:proofErr w:type="spellStart"/>
+      <w:r>
+        <w:rPr>
+          <w:b/>
+          <w:bCs/>
+          <w:sz w:val="32"/>
+          <w:szCs w:val="32"/>
+        </w:rPr>
+        <w:t>main</w:t>
+      </w:r>
+      <w:r>
+        <w:rPr>
+          <w:b/>
+          <w:bCs/>
+          <w:sz w:val="32"/>
+          <w:szCs w:val="32"/>
+        </w:rPr>
+        <w:t>_</w:t>
+      </w:r>
+      <w:proofErr w:type="gramStart"/>
+      <w:r>
+        <w:rPr>
+          <w:b/>
+          <w:bCs/>
+          <w:sz w:val="32"/>
+          <w:szCs w:val="32"/>
+        </w:rPr>
+        <w:t>dev</w:t>
+      </w:r>
+      <w:r>
+        <w:rPr>
+          <w:b/>
+          <w:bCs/>
+          <w:sz w:val="32"/>
+          <w:szCs w:val="32"/>
+        </w:rPr>
+        <w:t>.dart</w:t>
+      </w:r>
+      <w:proofErr w:type="spellEnd"/>
+      <w:proofErr w:type="gramEnd"/>
+      <w:r>
+        <w:rPr>
+          <w:sz w:val="32"/>
+          <w:szCs w:val="32"/>
+        </w:rPr>
+        <w:t xml:space="preserve"> </w:t>
+      </w:r>
+      <w:r>
+        <w:sym w:font="Wingdings" w:char="F0E0"/>
+      </w:r>
+      <w:r>
+        <w:rPr>
+          <w:sz w:val="32"/>
+          <w:szCs w:val="32"/>
+        </w:rPr>
+        <w:t xml:space="preserve"> --flavor </w:t>
+      </w:r>
+      <w:r>
+        <w:rPr>
+          <w:sz w:val="32"/>
+          <w:szCs w:val="32"/>
+        </w:rPr>
+        <w:t>dev</w:t>
+      </w:r>
+      <w:r>
+        <w:rPr>
+          <w:sz w:val="32"/>
+          <w:szCs w:val="32"/>
+        </w:rPr>
+        <w:t xml:space="preserve"> --dart-define-from-file=config/</w:t>
+      </w:r>
+      <w:proofErr w:type="spellStart"/>
+      <w:r>
+        <w:rPr>
+          <w:sz w:val="32"/>
+          <w:szCs w:val="32"/>
+        </w:rPr>
+        <w:t>dev</w:t>
+      </w:r>
+      <w:r>
+        <w:rPr>
+          <w:sz w:val="32"/>
+          <w:szCs w:val="32"/>
+        </w:rPr>
+        <w:t>.json</w:t>
+      </w:r>
+      <w:proofErr w:type="spellEnd"/>
+    </w:p>
+    <w:p>
+      <w:pPr>
+        <w:pStyle w:val="ListParagraph"/>
+        <w:numPr>
+          <w:ilvl w:val="0"/>
+          <w:numId w:val="7"/>
+        </w:numPr>
+        <w:jc w:val="both"/>
+        <w:rPr>
+          <w:sz w:val="32"/>
+          <w:szCs w:val="32"/>
+        </w:rPr>
+      </w:pPr>
+      <w:proofErr w:type="spellStart"/>
+      <w:r>
+        <w:rPr>
+          <w:b/>
+          <w:bCs/>
+          <w:sz w:val="32"/>
+          <w:szCs w:val="32"/>
+        </w:rPr>
+        <w:t>main</w:t>
+      </w:r>
+      <w:r>
+        <w:rPr>
+          <w:b/>
+          <w:bCs/>
+          <w:sz w:val="32"/>
+          <w:szCs w:val="32"/>
+        </w:rPr>
+        <w:t>_</w:t>
+      </w:r>
+      <w:proofErr w:type="gramStart"/>
+      <w:r>
+        <w:rPr>
+          <w:b/>
+          <w:bCs/>
+          <w:sz w:val="32"/>
+          <w:szCs w:val="32"/>
+        </w:rPr>
+        <w:t>staging</w:t>
+      </w:r>
+      <w:r>
+        <w:rPr>
+          <w:b/>
+          <w:bCs/>
+          <w:sz w:val="32"/>
+          <w:szCs w:val="32"/>
+        </w:rPr>
+        <w:t>.dart</w:t>
+      </w:r>
+      <w:proofErr w:type="spellEnd"/>
+      <w:proofErr w:type="gramEnd"/>
+      <w:r>
+        <w:rPr>
+          <w:sz w:val="32"/>
+          <w:szCs w:val="32"/>
+        </w:rPr>
+        <w:t xml:space="preserve"> </w:t>
+      </w:r>
+      <w:r>
+        <w:sym w:font="Wingdings" w:char="F0E0"/>
+      </w:r>
+      <w:r>
+        <w:rPr>
+          <w:sz w:val="32"/>
+          <w:szCs w:val="32"/>
+        </w:rPr>
+        <w:t xml:space="preserve"> --flavor </w:t>
+      </w:r>
+      <w:r>
+        <w:rPr>
+          <w:sz w:val="32"/>
+          <w:szCs w:val="32"/>
+        </w:rPr>
+        <w:t>staging</w:t>
+      </w:r>
+      <w:r>
+        <w:rPr>
+          <w:sz w:val="32"/>
+          <w:szCs w:val="32"/>
+        </w:rPr>
+        <w:t xml:space="preserve"> --dart-define-from-file=config/</w:t>
+      </w:r>
+      <w:proofErr w:type="spellStart"/>
+      <w:r>
+        <w:rPr>
+          <w:sz w:val="32"/>
+          <w:szCs w:val="32"/>
+        </w:rPr>
+        <w:t>staging</w:t>
+      </w:r>
+      <w:r>
+        <w:rPr>
+          <w:sz w:val="32"/>
+          <w:szCs w:val="32"/>
+        </w:rPr>
+        <w:t>.json</w:t>
+      </w:r>
+      <w:proofErr w:type="spellEnd"/>
+    </w:p>
+    <w:p>
+      <w:pPr>
+        <w:jc w:val="both"/>
+        <w:rPr>
+          <w:sz w:val="32"/>
+          <w:szCs w:val="32"/>
+        </w:rPr>
+      </w:pPr>
+    </w:p>
+    <w:p>
+      <w:pPr>
+        <w:jc w:val="center"/>
+        <w:rPr>
+          <w:sz w:val="32"/>
+          <w:szCs w:val="32"/>
+        </w:rPr>
+      </w:pPr>
+      <w:r>
+        <w:rPr>
+          <w:sz w:val="32"/>
+          <w:szCs w:val="32"/>
+        </w:rPr>
+        <w:t>Break</w:t>
       </w:r>
     </w:p>
     <w:p>
@@ -4750,6 +6048,119 @@
 <file path=word/numbering.xml><?xml version="1.0" encoding="utf-8"?>
 <w:numbering xmlns:wpc="http://schemas.microsoft.com/office/word/2010/wordprocessingCanvas" xmlns:cx="http://schemas.microsoft.com/office/drawing/2014/chartex" xmlns:cx1="http://schemas.microsoft.com/office/drawing/2015/9/8/chartex" xmlns:cx2="http://schemas.microsoft.com/office/drawing/2015/10/21/chartex" xmlns:cx3="http://schemas.microsoft.com/office/drawing/2016/5/9/chartex" xmlns:cx4="http://schemas.microsoft.com/office/drawing/2016/5/10/chartex" xmlns:cx5="http://schemas.microsoft.com/office/drawing/2016/5/11/chartex" xmlns:cx6="http://schemas.microsoft.com/office/drawing/2016/5/12/chartex" xmlns:cx7="http://schemas.microsoft.com/office/drawing/2016/5/13/chartex" xmlns:cx8="http://schemas.microsoft.com/office/drawing/2016/5/14/chartex" xmlns:mc="http://schemas.openxmlformats.org/markup-compatibility/2006" xmlns:aink="http://schemas.microsoft.com/office/drawing/2016/ink" xmlns:am3d="http://schemas.microsoft.com/office/drawing/2017/model3d" xmlns:o="urn:schemas-microsoft-com:office:office" xmlns:oel="http://schemas.microsoft.com/office/2019/extlst" xmlns:r="http://schemas.openxmlformats.org/officeDocument/2006/relationships" xmlns:m="http://schemas.openxmlformats.org/officeDocument/2006/math" xmlns:v="urn:schemas-microsoft-com:vml" xmlns:wp14="http://schemas.microsoft.com/office/word/2010/wordprocessingDrawing" xmlns:wp="http://schemas.openxmlformats.org/drawingml/2006/wordprocessingDrawing" xmlns:w10="urn:schemas-microsoft-com:office:word" xmlns:w="http://schemas.openxmlformats.org/wordprocessingml/2006/main" xmlns:w14="http://schemas.microsoft.com/office/word/2010/wordml" xmlns:w15="http://schemas.microsoft.com/office/word/2012/wordml" xmlns:w16cex="http://schemas.microsoft.com/office/word/2018/wordml/cex" xmlns:w16cid="http://schemas.microsoft.com/office/word/2016/wordml/cid" xmlns:w16="http://schemas.microsoft.com/office/word/2018/wordml" xmlns:w16sdtdh="http://schemas.microsoft.com/office/word/2020/wordml/sdtdatahash" xmlns:w16se="http://schemas.microsoft.com/office/word/2015/wordml/symex" xmlns:wpg="http://schemas.microsoft.com/office/word/2010/wordprocessingGroup" xmlns:wpi="http://schemas.microsoft.com/office/word/2010/wordprocessingInk" xmlns:wne="http://schemas.microsoft.com/office/word/2006/wordml" xmlns:wps="http://schemas.microsoft.com/office/word/2010/wordprocessingShape" mc:Ignorable="w14 w15 w16se w16cid w16 w16cex w16sdtdh wp14">
   <w:abstractNum w:abstractNumId="0" w15:restartNumberingAfterBreak="0">
+    <w:nsid w:val="00FF5A1F"/>
+    <w:multiLevelType w:val="hybridMultilevel"/>
+    <w:tmpl w:val="2ED4EC28"/>
+    <w:lvl w:ilvl="0" w:tplc="04090001">
+      <w:start w:val="1"/>
+      <w:numFmt w:val="bullet"/>
+      <w:lvlText w:val=""/>
+      <w:lvlJc w:val="left"/>
+      <w:pPr>
+        <w:ind w:left="360" w:hanging="360"/>
+      </w:pPr>
+      <w:rPr>
+        <w:rFonts w:ascii="Symbol" w:hAnsi="Symbol" w:hint="default"/>
+      </w:rPr>
+    </w:lvl>
+    <w:lvl w:ilvl="1" w:tplc="04090003" w:tentative="1">
+      <w:start w:val="1"/>
+      <w:numFmt w:val="bullet"/>
+      <w:lvlText w:val="o"/>
+      <w:lvlJc w:val="left"/>
+      <w:pPr>
+        <w:ind w:left="1080" w:hanging="360"/>
+      </w:pPr>
+      <w:rPr>
+        <w:rFonts w:ascii="Courier New" w:hAnsi="Courier New" w:cs="Courier New" w:hint="default"/>
+      </w:rPr>
+    </w:lvl>
+    <w:lvl w:ilvl="2" w:tplc="04090005" w:tentative="1">
+      <w:start w:val="1"/>
+      <w:numFmt w:val="bullet"/>
+      <w:lvlText w:val=""/>
+      <w:lvlJc w:val="left"/>
+      <w:pPr>
+        <w:ind w:left="1800" w:hanging="360"/>
+      </w:pPr>
+      <w:rPr>
+        <w:rFonts w:ascii="Wingdings" w:hAnsi="Wingdings" w:hint="default"/>
+      </w:rPr>
+    </w:lvl>
+    <w:lvl w:ilvl="3" w:tplc="04090001" w:tentative="1">
+      <w:start w:val="1"/>
+      <w:numFmt w:val="bullet"/>
+      <w:lvlText w:val=""/>
+      <w:lvlJc w:val="left"/>
+      <w:pPr>
+        <w:ind w:left="2520" w:hanging="360"/>
+      </w:pPr>
+      <w:rPr>
+        <w:rFonts w:ascii="Symbol" w:hAnsi="Symbol" w:hint="default"/>
+      </w:rPr>
+    </w:lvl>
+    <w:lvl w:ilvl="4" w:tplc="04090003" w:tentative="1">
+      <w:start w:val="1"/>
+      <w:numFmt w:val="bullet"/>
+      <w:lvlText w:val="o"/>
+      <w:lvlJc w:val="left"/>
+      <w:pPr>
+        <w:ind w:left="3240" w:hanging="360"/>
+      </w:pPr>
+      <w:rPr>
+        <w:rFonts w:ascii="Courier New" w:hAnsi="Courier New" w:cs="Courier New" w:hint="default"/>
+      </w:rPr>
+    </w:lvl>
+    <w:lvl w:ilvl="5" w:tplc="04090005" w:tentative="1">
+      <w:start w:val="1"/>
+      <w:numFmt w:val="bullet"/>
+      <w:lvlText w:val=""/>
+      <w:lvlJc w:val="left"/>
+      <w:pPr>
+        <w:ind w:left="3960" w:hanging="360"/>
+      </w:pPr>
+      <w:rPr>
+        <w:rFonts w:ascii="Wingdings" w:hAnsi="Wingdings" w:hint="default"/>
+      </w:rPr>
+    </w:lvl>
+    <w:lvl w:ilvl="6" w:tplc="04090001" w:tentative="1">
+      <w:start w:val="1"/>
+      <w:numFmt w:val="bullet"/>
+      <w:lvlText w:val=""/>
+      <w:lvlJc w:val="left"/>
+      <w:pPr>
+        <w:ind w:left="4680" w:hanging="360"/>
+      </w:pPr>
+      <w:rPr>
+        <w:rFonts w:ascii="Symbol" w:hAnsi="Symbol" w:hint="default"/>
+      </w:rPr>
+    </w:lvl>
+    <w:lvl w:ilvl="7" w:tplc="04090003" w:tentative="1">
+      <w:start w:val="1"/>
+      <w:numFmt w:val="bullet"/>
+      <w:lvlText w:val="o"/>
+      <w:lvlJc w:val="left"/>
+      <w:pPr>
+        <w:ind w:left="5400" w:hanging="360"/>
+      </w:pPr>
+      <w:rPr>
+        <w:rFonts w:ascii="Courier New" w:hAnsi="Courier New" w:cs="Courier New" w:hint="default"/>
+      </w:rPr>
+    </w:lvl>
+    <w:lvl w:ilvl="8" w:tplc="04090005" w:tentative="1">
+      <w:start w:val="1"/>
+      <w:numFmt w:val="bullet"/>
+      <w:lvlText w:val=""/>
+      <w:lvlJc w:val="left"/>
+      <w:pPr>
+        <w:ind w:left="6120" w:hanging="360"/>
+      </w:pPr>
+      <w:rPr>
+        <w:rFonts w:ascii="Wingdings" w:hAnsi="Wingdings" w:hint="default"/>
+      </w:rPr>
+    </w:lvl>
+  </w:abstractNum>
+  <w:abstractNum w:abstractNumId="1" w15:restartNumberingAfterBreak="0">
     <w:nsid w:val="0E8402B8"/>
     <w:multiLevelType w:val="hybridMultilevel"/>
     <w:tmpl w:val="152205F2"/>
@@ -4840,7 +6251,7 @@
       </w:pPr>
     </w:lvl>
   </w:abstractNum>
-  <w:abstractNum w:abstractNumId="1" w15:restartNumberingAfterBreak="0">
+  <w:abstractNum w:abstractNumId="2" w15:restartNumberingAfterBreak="0">
     <w:nsid w:val="33D65B46"/>
     <w:multiLevelType w:val="hybridMultilevel"/>
     <w:tmpl w:val="97C84A32"/>
@@ -4953,7 +6364,7 @@
       </w:rPr>
     </w:lvl>
   </w:abstractNum>
-  <w:abstractNum w:abstractNumId="2" w15:restartNumberingAfterBreak="0">
+  <w:abstractNum w:abstractNumId="3" w15:restartNumberingAfterBreak="0">
     <w:nsid w:val="3B6F51AB"/>
     <w:multiLevelType w:val="hybridMultilevel"/>
     <w:tmpl w:val="C0BC82D8"/>
@@ -5066,7 +6477,7 @@
       </w:rPr>
     </w:lvl>
   </w:abstractNum>
-  <w:abstractNum w:abstractNumId="3" w15:restartNumberingAfterBreak="0">
+  <w:abstractNum w:abstractNumId="4" w15:restartNumberingAfterBreak="0">
     <w:nsid w:val="433F04D3"/>
     <w:multiLevelType w:val="hybridMultilevel"/>
     <w:tmpl w:val="97B0BD8C"/>
@@ -5179,7 +6590,7 @@
       </w:rPr>
     </w:lvl>
   </w:abstractNum>
-  <w:abstractNum w:abstractNumId="4" w15:restartNumberingAfterBreak="0">
+  <w:abstractNum w:abstractNumId="5" w15:restartNumberingAfterBreak="0">
     <w:nsid w:val="4BB06751"/>
     <w:multiLevelType w:val="hybridMultilevel"/>
     <w:tmpl w:val="AFE0BFF4"/>
@@ -5292,7 +6703,7 @@
       </w:rPr>
     </w:lvl>
   </w:abstractNum>
-  <w:abstractNum w:abstractNumId="5" w15:restartNumberingAfterBreak="0">
+  <w:abstractNum w:abstractNumId="6" w15:restartNumberingAfterBreak="0">
     <w:nsid w:val="66201553"/>
     <w:multiLevelType w:val="multilevel"/>
     <w:tmpl w:val="7348F84E"/>
@@ -5442,22 +6853,25 @@
     </w:lvl>
   </w:abstractNum>
   <w:num w:numId="1" w16cid:durableId="196358792">
+    <w:abstractNumId w:val="3"/>
+  </w:num>
+  <w:num w:numId="2" w16cid:durableId="765927455">
+    <w:abstractNumId w:val="6"/>
+  </w:num>
+  <w:num w:numId="3" w16cid:durableId="1069772638">
     <w:abstractNumId w:val="2"/>
   </w:num>
-  <w:num w:numId="2" w16cid:durableId="765927455">
+  <w:num w:numId="4" w16cid:durableId="1469476909">
+    <w:abstractNumId w:val="1"/>
+  </w:num>
+  <w:num w:numId="5" w16cid:durableId="1305965410">
     <w:abstractNumId w:val="5"/>
   </w:num>
-  <w:num w:numId="3" w16cid:durableId="1069772638">
-    <w:abstractNumId w:val="1"/>
-  </w:num>
-  <w:num w:numId="4" w16cid:durableId="1469476909">
-    <w:abstractNumId w:val="0"/>
-  </w:num>
-  <w:num w:numId="5" w16cid:durableId="1305965410">
+  <w:num w:numId="6" w16cid:durableId="705562101">
     <w:abstractNumId w:val="4"/>
   </w:num>
-  <w:num w:numId="6" w16cid:durableId="705562101">
-    <w:abstractNumId w:val="3"/>
+  <w:num w:numId="7" w16cid:durableId="735979982">
+    <w:abstractNumId w:val="0"/>
   </w:num>
 </w:numbering>
 </file>
@@ -6065,6 +7479,7 @@
   <w:style w:type="character" w:default="1" w:styleId="DefaultParagraphFont">
     <w:name w:val="Default Paragraph Font"/>
     <w:uiPriority w:val="1"/>
+    <w:semiHidden/>
     <w:unhideWhenUsed/>
   </w:style>
   <w:style w:type="table" w:default="1" w:styleId="TableNormal">

</xml_diff>